<commit_message>
docs: distinguish course sources, SPIN reference and runtime prompts
</commit_message>
<xml_diff>
--- a/docs/Averon_analysis_basis.docx
+++ b/docs/Averon_analysis_basis.docx
@@ -15,7 +15,7 @@
         <w:pStyle w:val="Subtitle"/>
       </w:pPr>
       <w:r>
-        <w:t>Пояснение для руководителя и менеджера • проверено 5 октября 2026</w:t>
+        <w:t>Пояснение для руководителя и менеджера • источники дополнены 5 октября 2026</w:t>
       </w:r>
     </w:p>
     <w:p>
@@ -104,6 +104,123 @@
       </w:pPr>
       <w:r>
         <w:t>Бот не открывает сайт клиента, прайсы и учебный портал для проверки каждого звонка. Ваш рабочий стол и файлы компьютера также не становятся источником анализа сами по себе. Модель использует общие языковые знания для пояснений, но они не подтверждают факты конкретной сделки.</w:t>
+      </w:r>
+    </w:p>
+    <w:p>
+      <w:r>
+        <w:br w:type="page"/>
+      </w:r>
+    </w:p>
+    <w:p>
+      <w:pPr>
+        <w:pStyle w:val="Title"/>
+      </w:pPr>
+      <w:r>
+        <w:t>Литература и учебные источники</w:t>
+      </w:r>
+    </w:p>
+    <w:p>
+      <w:pPr>
+        <w:pStyle w:val="Heading1"/>
+      </w:pPr>
+      <w:r>
+        <w:t>Что действительно передаётся модели</w:t>
+      </w:r>
+    </w:p>
+    <w:p>
+      <w:pPr>
+        <w:pStyle w:val="Normal"/>
+      </w:pPr>
+      <w:r>
+        <w:t>Непосредственная инструкция для анализа — действующие промпты проекта и правила выбранного профиля. Полные тексты книг не загружаются в запрос разбора; отдельной подключённой библиотеки литературы в текущем проекте не обнаружено. Правила проекта, учебный источник этих правил и справочная книга — разные основания.</w:t>
+      </w:r>
+    </w:p>
+    <w:p>
+      <w:pPr>
+        <w:pStyle w:val="Heading1"/>
+      </w:pPr>
+      <w:r>
+        <w:t>1. Курс «Новое обучение для мпп 2025»</w:t>
+      </w:r>
+    </w:p>
+    <w:p>
+      <w:pPr>
+        <w:pStyle w:val="Normal"/>
+      </w:pPr>
+      <w:r>
+        <w:t>Учебная основа предметной методики — курс №376252 на Антитренингах. В проект перенесены правила из предоставленного пользователем анализа от 1 октября 2026, включая сверку связанных Google-материалов. Программа не получает все страницы курса при каждом звонке и не проверяет их актуальность заново.</w:t>
+      </w:r>
+    </w:p>
+    <w:p>
+      <w:pPr>
+        <w:pStyle w:val="Normal"/>
+      </w:pPr>
+      <w:r>
+        <w:t>Основные темы: выход на нужного человека, краткая зацепка, диагностика потребности, уместная презентация, экономика, возражения и продолжение. Продуктовые уроки добавляют подготовку демо, ожидания от контактов, готовность обработки и сопровождение после запуска.</w:t>
+      </w:r>
+    </w:p>
+    <w:p>
+      <w:pPr>
+        <w:pStyle w:val="Normal"/>
+      </w:pPr>
+      <w:r>
+        <w:t>Примеры первичных уроков из предоставленного анализа: выявление потребностей — https://antitreningi.ru/student/lessons/lesson?course_id=376252&amp;lesson_id=8118507 ; презентация — lesson_id=8118508; финансовый расчёт — lesson_id=8118510; возражения — lesson_id=8118511. Это ссылки на учебные материалы, а не подтверждение текущих условий продажи.</w:t>
+      </w:r>
+    </w:p>
+    <w:p>
+      <w:pPr>
+        <w:pStyle w:val="Normal"/>
+      </w:pPr>
+      <w:r>
+        <w:t>Связанные прайсы, скрипты и регламенты учитывались через текст пользовательской сверки. Они помогли различать контакт и заявку, продажу Averon и звонок отдела продаж заказчика, режимы колл-центра и сопровождение. Их полный текст не приложен к каждому запросу модели; внутренний прайс не стал утверждённым каталогом обещаний.</w:t>
+      </w:r>
+    </w:p>
+    <w:p>
+      <w:pPr>
+        <w:pStyle w:val="Heading1"/>
+      </w:pPr>
+      <w:r>
+        <w:t>2. СПИН: упомянутая методика и справочная книга</w:t>
+      </w:r>
+    </w:p>
+    <w:p>
+      <w:pPr>
+        <w:pStyle w:val="Normal"/>
+      </w:pPr>
+      <w:r>
+        <w:t>В подробном промпте проекта прямо упомянуто обучение по СПИН. Исходная шкала использует ситуационные, проблемные и извлекающие вопросы, различает неявную и явную потребность. Связь этих терминов со СПИН — обоснованное сопоставление правил; это не доказательство загрузки книги.</w:t>
+      </w:r>
+    </w:p>
+    <w:p>
+      <w:pPr>
+        <w:pStyle w:val="Normal"/>
+      </w:pPr>
+      <w:r>
+        <w:t>Библиографическая справка: Neil Rackham (Нил Рэкхэм), SPIN Selling («СПИН-продажи»), McGraw-Hill, 1988; ISBN 9780070511132. Автор, название и издание проверены по странице издателя: https://www.mheducation.com/highered/mhp/product/spin-selling.html . Книга указана для понимания происхождения методики, а не как подключённый полный текст.</w:t>
+      </w:r>
+    </w:p>
+    <w:p>
+      <w:pPr>
+        <w:pStyle w:val="Normal"/>
+      </w:pPr>
+      <w:r>
+        <w:t>В текущих промптах нет указания автора, издания, глав или страниц этой книги. Поэтому нельзя утверждать, что вся оценка следует ей дословно. Веса критериев, цель назначения встречи, правило соотношения вопросов и пороги ✅/⚠️/❌ — зафиксированные правила проекта; их происхождение из конкретных страниц книги не подтверждено.</w:t>
+      </w:r>
+    </w:p>
+    <w:p>
+      <w:pPr>
+        <w:pStyle w:val="Heading1"/>
+      </w:pPr>
+      <w:r>
+        <w:t>Какие источники нельзя приписать боту</w:t>
+      </w:r>
+    </w:p>
+    <w:p>
+      <w:pPr>
+        <w:pStyle w:val="Normal"/>
+      </w:pPr>
+      <w:r>
+        <w:t>Использование других конкретных книг в действующем запросе анализа не подтверждено. Общие знания языковой модели не позволяют установить перечень прочитанных ею книг и не заменяют список подключённых источников. Неизученные видео, аудиозаписи и неутверждённые коммерческие условия также не становятся проверенной основой оценки.</w:t>
       </w:r>
     </w:p>
     <w:p>

</xml_diff>